<commit_message>
update head credit name in contract
</commit_message>
<xml_diff>
--- a/document_templates/Contracts/company/contract_caution_company.docx
+++ b/document_templates/Contracts/company/contract_caution_company.docx
@@ -729,18 +729,7 @@
           <w:bCs/>
           <w:lang w:val="en-US"/>
         </w:rPr>
-        <w:t>${type_of_identity_document</w:t>
-      </w:r>
-      <w:bookmarkStart w:id="6" w:name="_GoBack"/>
-      <w:bookmarkEnd w:id="6"/>
-      <w:r>
-        <w:rPr>
-          <w:rFonts w:cs="Times New Roman"/>
-          <w:b/>
-          <w:bCs/>
-          <w:lang w:val="en-US"/>
-        </w:rPr>
-        <w:t>}</w:t>
+        <w:t>${type_of_identity_document}</w:t>
       </w:r>
       <w:r>
         <w:rPr>
@@ -2826,67 +2815,59 @@
     </w:p>
     <w:p>
       <w:pPr>
-        <w:rPr>
-          <w:rFonts w:ascii="Times New Roman" w:hAnsi="Times New Roman" w:cs="Times New Roman"/>
+        <w:jc w:val="both"/>
+        <w:rPr>
+          <w:rFonts w:hint="default" w:ascii="Times New Roman" w:hAnsi="Times New Roman" w:cs="Times New Roman"/>
           <w:bCs/>
           <w:iCs/>
           <w:sz w:val="24"/>
           <w:szCs w:val="24"/>
         </w:rPr>
       </w:pPr>
-      <w:r>
-        <w:rPr>
-          <w:rFonts w:cs="Times New Roman"/>
+    </w:p>
+    <w:p>
+      <w:pPr>
+        <w:jc w:val="both"/>
+        <w:rPr>
+          <w:rFonts w:ascii="Times New Roman" w:hAnsi="Times New Roman" w:cs="Times New Roman"/>
+          <w:b/>
+          <w:bCs/>
+          <w:iCs/>
+        </w:rPr>
+      </w:pPr>
+      <w:bookmarkStart w:id="6" w:name="_GoBack"/>
+      <w:bookmarkEnd w:id="6"/>
+      <w:r>
+        <w:rPr>
+          <w:rFonts w:hint="default" w:ascii="Times New Roman" w:hAnsi="Times New Roman" w:cs="Times New Roman"/>
           <w:bCs/>
           <w:iCs/>
           <w:sz w:val="24"/>
           <w:szCs w:val="24"/>
         </w:rPr>
-        <w:t xml:space="preserve">Head Crédit                                                           </w:t>
-      </w:r>
-      <w:r>
-        <w:rPr>
-          <w:rFonts w:cs="Times New Roman"/>
+        <w:t xml:space="preserve">Responsable du Département Crédit                                   </w:t>
+      </w:r>
+      <w:r>
+        <w:rPr>
+          <w:rFonts w:hint="default" w:ascii="Times New Roman" w:hAnsi="Times New Roman" w:cs="Times New Roman"/>
           <w:bCs/>
           <w:iCs/>
           <w:sz w:val="24"/>
           <w:szCs w:val="24"/>
-          <w:lang w:val="en-US"/>
-        </w:rPr>
-        <w:tab/>
-      </w:r>
-      <w:r>
-        <w:rPr>
-          <w:rFonts w:cs="Times New Roman"/>
+          <w:lang w:val="fr-FR"/>
+        </w:rPr>
+        <w:t xml:space="preserve">  </w:t>
+      </w:r>
+      <w:r>
+        <w:rPr>
+          <w:rFonts w:hint="default" w:ascii="Times New Roman" w:hAnsi="Times New Roman" w:cs="Times New Roman"/>
           <w:bCs/>
           <w:iCs/>
           <w:sz w:val="24"/>
           <w:szCs w:val="24"/>
-          <w:lang w:val="en-US"/>
-        </w:rPr>
-        <w:tab/>
-      </w:r>
-      <w:r>
-        <w:rPr>
-          <w:rFonts w:cs="Times New Roman"/>
-          <w:bCs/>
-          <w:iCs/>
-          <w:sz w:val="24"/>
-          <w:szCs w:val="24"/>
         </w:rPr>
         <w:t>Responsable juridique</w:t>
       </w:r>
-    </w:p>
-    <w:p>
-      <w:pPr>
-        <w:jc w:val="both"/>
-        <w:rPr>
-          <w:rFonts w:ascii="Times New Roman" w:hAnsi="Times New Roman" w:cs="Times New Roman"/>
-          <w:b/>
-          <w:bCs/>
-          <w:iCs/>
-        </w:rPr>
-      </w:pPr>
     </w:p>
     <w:p>
       <w:pPr>

</xml_diff>